<commit_message>
docs(truc-a): OWNER_DIGEST — nhật ký đầy đủ trục A "Chạm người dùng thật"
Ghi lại 8 lát (L0→L6) + vá Reviewer F176–F183 + trả nợ bảo mật F22:
18/18 màn persona rời mock, lib/mock.ts đã xoá, 495/495 test,
next build 32 route, 4 driver sống 120/120 chạy hai vòng đều xanh.

Kèm bản cập nhật tờ trình PTGĐ R&D&CN.

Co-Authored-By: Claude Opus 4.8 <noreply@anthropic.com>
</commit_message>
<xml_diff>
--- a/08-to-trinh/NHG_iPMS_To_Trinh_PTGD_RD_CongNghe.docx
+++ b/08-to-trinh/NHG_iPMS_To_Trinh_PTGD_RD_CongNghe.docx
@@ -2022,157 +2022,24 @@
         <w:tab w:val="right" w:pos="9519"/>
       </w:tabs>
     </w:pPr>
+  </w:p>
+  <w:p>
+    <w:pPr>
+      <w:pStyle w:val="Footer"/>
+      <w:pBdr>
+        <w:top w:val="single" w:sz="4" w:space="3" w:color="BBBBBB"/>
+      </w:pBdr>
+      <w:tabs>
+        <w:tab w:val="right" w:pos="9519"/>
+      </w:tabs>
+    </w:pPr>
     <w:r>
       <w:rPr>
         <w:rFonts w:cs="Times New Roman"/>
         <w:color w:val="555555"/>
         <w:sz w:val="18"/>
       </w:rPr>
-      <w:t xml:space="preserve">Ban </w:t>
-    </w:r>
-    <w:proofErr w:type="spellStart"/>
-    <w:r>
-      <w:rPr>
-        <w:rFonts w:cs="Times New Roman"/>
-        <w:color w:val="555555"/>
-        <w:sz w:val="18"/>
-      </w:rPr>
-      <w:t>Nghiên</w:t>
-    </w:r>
-    <w:proofErr w:type="spellEnd"/>
-    <w:r>
-      <w:rPr>
-        <w:rFonts w:cs="Times New Roman"/>
-        <w:color w:val="555555"/>
-        <w:sz w:val="18"/>
-      </w:rPr>
-      <w:t xml:space="preserve"> </w:t>
-    </w:r>
-    <w:proofErr w:type="spellStart"/>
-    <w:r>
-      <w:rPr>
-        <w:rFonts w:cs="Times New Roman"/>
-        <w:color w:val="555555"/>
-        <w:sz w:val="18"/>
-      </w:rPr>
-      <w:t>cứu</w:t>
-    </w:r>
-    <w:proofErr w:type="spellEnd"/>
-    <w:r>
-      <w:rPr>
-        <w:rFonts w:cs="Times New Roman"/>
-        <w:color w:val="555555"/>
-        <w:sz w:val="18"/>
-      </w:rPr>
-      <w:t xml:space="preserve">, </w:t>
-    </w:r>
-    <w:proofErr w:type="spellStart"/>
-    <w:r>
-      <w:rPr>
-        <w:rFonts w:cs="Times New Roman"/>
-        <w:color w:val="555555"/>
-        <w:sz w:val="18"/>
-      </w:rPr>
-      <w:t>Phát</w:t>
-    </w:r>
-    <w:proofErr w:type="spellEnd"/>
-    <w:r>
-      <w:rPr>
-        <w:rFonts w:cs="Times New Roman"/>
-        <w:color w:val="555555"/>
-        <w:sz w:val="18"/>
-      </w:rPr>
-      <w:t xml:space="preserve"> </w:t>
-    </w:r>
-    <w:proofErr w:type="spellStart"/>
-    <w:r>
-      <w:rPr>
-        <w:rFonts w:cs="Times New Roman"/>
-        <w:color w:val="555555"/>
-        <w:sz w:val="18"/>
-      </w:rPr>
-      <w:t>triển</w:t>
-    </w:r>
-    <w:proofErr w:type="spellEnd"/>
-    <w:r>
-      <w:rPr>
-        <w:rFonts w:cs="Times New Roman"/>
-        <w:color w:val="555555"/>
-        <w:sz w:val="18"/>
-      </w:rPr>
-      <w:t xml:space="preserve"> </w:t>
-    </w:r>
-    <w:proofErr w:type="spellStart"/>
-    <w:r>
-      <w:rPr>
-        <w:rFonts w:cs="Times New Roman"/>
-        <w:color w:val="555555"/>
-        <w:sz w:val="18"/>
-      </w:rPr>
-      <w:t>và</w:t>
-    </w:r>
-    <w:proofErr w:type="spellEnd"/>
-    <w:r>
-      <w:rPr>
-        <w:rFonts w:cs="Times New Roman"/>
-        <w:color w:val="555555"/>
-        <w:sz w:val="18"/>
-      </w:rPr>
-      <w:t xml:space="preserve"> </w:t>
-    </w:r>
-    <w:proofErr w:type="spellStart"/>
-    <w:r>
-      <w:rPr>
-        <w:rFonts w:cs="Times New Roman"/>
-        <w:color w:val="555555"/>
-        <w:sz w:val="18"/>
-      </w:rPr>
-      <w:t>Ứng</w:t>
-    </w:r>
-    <w:proofErr w:type="spellEnd"/>
-    <w:r>
-      <w:rPr>
-        <w:rFonts w:cs="Times New Roman"/>
-        <w:color w:val="555555"/>
-        <w:sz w:val="18"/>
-      </w:rPr>
-      <w:t xml:space="preserve"> </w:t>
-    </w:r>
-    <w:proofErr w:type="spellStart"/>
-    <w:r>
-      <w:rPr>
-        <w:rFonts w:cs="Times New Roman"/>
-        <w:color w:val="555555"/>
-        <w:sz w:val="18"/>
-      </w:rPr>
-      <w:t>dụng</w:t>
-    </w:r>
-    <w:proofErr w:type="spellEnd"/>
-    <w:r>
-      <w:rPr>
-        <w:rFonts w:cs="Times New Roman"/>
-        <w:color w:val="555555"/>
-        <w:sz w:val="18"/>
-      </w:rPr>
-      <w:t xml:space="preserve"> Công </w:t>
-    </w:r>
-    <w:proofErr w:type="spellStart"/>
-    <w:r>
-      <w:rPr>
-        <w:rFonts w:cs="Times New Roman"/>
-        <w:color w:val="555555"/>
-        <w:sz w:val="18"/>
-      </w:rPr>
-      <w:t>Nghệ</w:t>
-    </w:r>
-    <w:proofErr w:type="spellEnd"/>
-    <w:r>
-      <w:rPr>
-        <w:rFonts w:cs="Times New Roman"/>
-        <w:color w:val="555555"/>
-        <w:sz w:val="18"/>
-      </w:rPr>
-      <w:t xml:space="preserve"> (B3)</w:t>
+      <w:t>Ban Nghiên cứu, Phát triển và Ứng dụng Công Nghệ (B3)</w:t>
     </w:r>
     <w:r>
       <w:rPr>
@@ -14280,6 +14147,6 @@
 
 <file path=docMetadata/LabelInfo.xml><?xml version="1.0" encoding="utf-8"?>
 <clbl:labelList xmlns:clbl="http://schemas.microsoft.com/office/2020/mipLabelMetadata">
-  <clbl:label id="{defa4170-0d19-0005-0004-bc88714345d2}" enabled="1" method="Standard" siteId="{4c089d30-7a0b-4400-9798-d30aee6c73ff}" contentBits="0" removed="0"/>
+  <clbl:label id="{defa4170-0d19-0005-0004-bc88714345d2}" enabled="1" method="Standard" siteId="{4c089d30-7a0b-4400-9798-d30aee6c73ff}" removed="0"/>
 </clbl:labelList>
 </file>
</xml_diff>